<commit_message>
izvestaj i prezentacija v2
</commit_message>
<xml_diff>
--- a/Letic_Ciplic_Bitcoin.docx
+++ b/Letic_Ciplic_Bitcoin.docx
@@ -3413,23 +3413,7 @@
           <w:sz w:val="18"/>
           <w:szCs w:val="18"/>
         </w:rPr>
-        <w:t xml:space="preserve"> </w:t>
-      </w:r>
-      <w:proofErr w:type="spellStart"/>
-      <w:r>
-        <w:rPr>
-          <w:sz w:val="18"/>
-          <w:szCs w:val="18"/>
-        </w:rPr>
-        <w:t>i</w:t>
-      </w:r>
-      <w:proofErr w:type="spellEnd"/>
-      <w:r>
-        <w:rPr>
-          <w:sz w:val="18"/>
-          <w:szCs w:val="18"/>
-        </w:rPr>
-        <w:t xml:space="preserve"> </w:t>
+        <w:t xml:space="preserve"> i </w:t>
       </w:r>
       <w:proofErr w:type="spellStart"/>
       <w:r>
@@ -14337,7 +14321,15 @@
         <w:t>Label smoothing</w:t>
       </w:r>
       <w:r>
-        <w:t xml:space="preserve"> od 0,1 u </w:t>
+        <w:t xml:space="preserve"> </w:t>
+      </w:r>
+      <w:proofErr w:type="gramStart"/>
+      <w:r>
+        <w:t>od</w:t>
+      </w:r>
+      <w:proofErr w:type="gramEnd"/>
+      <w:r>
+        <w:t xml:space="preserve"> 0,1 u </w:t>
       </w:r>
       <w:proofErr w:type="spellStart"/>
       <w:r>
@@ -16822,6 +16814,7 @@
               <w:jc w:val="center"/>
             </w:pPr>
             <w:proofErr w:type="spellStart"/>
+            <w:proofErr w:type="gramStart"/>
             <w:r>
               <w:rPr>
                 <w:b/>
@@ -16839,7 +16832,17 @@
                 <w:sz w:val="16"/>
                 <w:szCs w:val="16"/>
               </w:rPr>
-              <w:t>.(%)</w:t>
+              <w:t>.(</w:t>
+            </w:r>
+            <w:proofErr w:type="gramEnd"/>
+            <w:r>
+              <w:rPr>
+                <w:b/>
+                <w:bCs/>
+                <w:sz w:val="16"/>
+                <w:szCs w:val="16"/>
+              </w:rPr>
+              <w:t>%)</w:t>
             </w:r>
           </w:p>
         </w:tc>
@@ -17191,12 +17194,21 @@
               <w:jc w:val="center"/>
             </w:pPr>
             <w:proofErr w:type="spellStart"/>
+            <w:proofErr w:type="gramStart"/>
             <w:r>
               <w:rPr>
                 <w:sz w:val="16"/>
                 <w:szCs w:val="16"/>
               </w:rPr>
-              <w:t>Prav.+ML</w:t>
+              <w:t>Prav.+</w:t>
+            </w:r>
+            <w:proofErr w:type="gramEnd"/>
+            <w:r>
+              <w:rPr>
+                <w:sz w:val="16"/>
+                <w:szCs w:val="16"/>
+              </w:rPr>
+              <w:t>ML</w:t>
             </w:r>
             <w:proofErr w:type="spellEnd"/>
           </w:p>
@@ -26724,12 +26736,17 @@
         <w:t xml:space="preserve"> </w:t>
       </w:r>
       <w:proofErr w:type="spellStart"/>
+      <w:proofErr w:type="gramStart"/>
       <w:r>
         <w:t>i</w:t>
       </w:r>
       <w:proofErr w:type="spellEnd"/>
       <w:r>
-        <w:t xml:space="preserve"> time </w:t>
+        <w:t xml:space="preserve"> time</w:t>
+      </w:r>
+      <w:proofErr w:type="gramEnd"/>
+      <w:r>
+        <w:t xml:space="preserve"> </w:t>
       </w:r>
       <w:proofErr w:type="spellStart"/>
       <w:r>
@@ -30353,7 +30370,15 @@
       </w:r>
       <w:proofErr w:type="spellEnd"/>
       <w:r>
-        <w:t xml:space="preserve"> „Oh great, another pump and dump, very bullish!“ </w:t>
+        <w:t xml:space="preserve"> „Oh great, another pump and dump, very </w:t>
+      </w:r>
+      <w:proofErr w:type="gramStart"/>
+      <w:r>
+        <w:t>bullish!“</w:t>
+      </w:r>
+      <w:proofErr w:type="gramEnd"/>
+      <w:r>
+        <w:t xml:space="preserve"> </w:t>
       </w:r>
       <w:proofErr w:type="spellStart"/>
       <w:r>
@@ -30500,7 +30525,15 @@
       </w:r>
       <w:proofErr w:type="spellEnd"/>
       <w:r>
-        <w:t xml:space="preserve"> („Bitcoin is NOT going to crash“) </w:t>
+        <w:t xml:space="preserve"> („Bitcoin is NOT going to </w:t>
+      </w:r>
+      <w:proofErr w:type="gramStart"/>
+      <w:r>
+        <w:t>crash“</w:t>
+      </w:r>
+      <w:proofErr w:type="gramEnd"/>
+      <w:r>
+        <w:t xml:space="preserve">) </w:t>
       </w:r>
       <w:proofErr w:type="spellStart"/>
       <w:r>
@@ -33183,21 +33216,7 @@
         <w:rPr>
           <w:lang w:val="en-US"/>
         </w:rPr>
-        <w:t xml:space="preserve"> </w:t>
-      </w:r>
-      <w:proofErr w:type="spellStart"/>
-      <w:r>
-        <w:rPr>
-          <w:lang w:val="en-US"/>
-        </w:rPr>
-        <w:t>na</w:t>
-      </w:r>
-      <w:proofErr w:type="spellEnd"/>
-      <w:r>
-        <w:rPr>
-          <w:lang w:val="en-US"/>
-        </w:rPr>
-        <w:t xml:space="preserve"> to da se </w:t>
+        <w:t xml:space="preserve"> na to da se </w:t>
       </w:r>
       <w:proofErr w:type="spellStart"/>
       <w:r>
@@ -33997,7 +34016,35 @@
           <w:sz w:val="16"/>
           <w:szCs w:val="16"/>
         </w:rPr>
-        <w:t xml:space="preserve"> "Cryptocurrency Price Prediction Using Twitter Sentiment Analysis" in CS &amp; IT - CSCP 2023, vol. 13, no. 3, pp. 13-22, 2023. DOI: 10.5121/csit.2023.130302</w:t>
+        <w:t xml:space="preserve"> </w:t>
+      </w:r>
+      <w:r>
+        <w:rPr>
+          <w:sz w:val="16"/>
+          <w:szCs w:val="16"/>
+        </w:rPr>
+        <w:t>‘</w:t>
+      </w:r>
+      <w:r>
+        <w:rPr>
+          <w:sz w:val="16"/>
+          <w:szCs w:val="16"/>
+        </w:rPr>
+        <w:t>Cryptocurrency Price Prediction Using Twitter Sentiment Analysis</w:t>
+      </w:r>
+      <w:r>
+        <w:rPr>
+          <w:sz w:val="16"/>
+          <w:szCs w:val="16"/>
+        </w:rPr>
+        <w:t>’</w:t>
+      </w:r>
+      <w:r>
+        <w:rPr>
+          <w:sz w:val="16"/>
+          <w:szCs w:val="16"/>
+        </w:rPr>
+        <w:t xml:space="preserve"> in CS &amp; IT - CSCP 2023, vol. 13, no. 3, pp. 13-22, 2023. DOI: 10.5121/csit.2023.130302</w:t>
       </w:r>
     </w:p>
     <w:p>
@@ -34773,6 +34820,7 @@
   <w:style w:type="character" w:default="1" w:styleId="DefaultParagraphFont">
     <w:name w:val="Default Paragraph Font"/>
     <w:uiPriority w:val="1"/>
+    <w:semiHidden/>
     <w:unhideWhenUsed/>
   </w:style>
   <w:style w:type="table" w:default="1" w:styleId="TableNormal">

</xml_diff>